<commit_message>
Fix cover page spacing: logo was overflowing to page 2
</commit_message>
<xml_diff>
--- a/40_AWS/04_修正依頼/Ksm_aws_015_修正依頼書_MySQLバックアップ設定_ja_vi.docx
+++ b/40_AWS/04_修正依頼/Ksm_aws_015_修正依頼書_MySQLバックアップ設定_ja_vi.docx
@@ -4,7 +4,7 @@
   <w:body>
     <w:p>
       <w:pPr>
-        <w:spacing w:before="4800" w:after="80"/>
+        <w:spacing w:before="3600" w:after="80"/>
         <w:jc w:val="center"/>
       </w:pPr>
       <w:r>
@@ -41,7 +41,7 @@
     </w:p>
     <w:p>
       <w:pPr>
-        <w:spacing w:before="2400" w:after="0"/>
+        <w:spacing w:before="1600" w:after="0"/>
       </w:pPr>
       <w:r>
         <w:rPr>
@@ -573,7 +573,7 @@
     </w:tbl>
     <w:p>
       <w:pPr>
-        <w:spacing w:before="1400" w:after="0"/>
+        <w:spacing w:before="800" w:after="0"/>
         <w:jc w:val="center"/>
       </w:pPr>
       <w:r>

</xml_diff>